<commit_message>
React test with Reduce method
</commit_message>
<xml_diff>
--- a/Assignment 5/assignment 6-react wordle redux-3.docx
+++ b/Assignment 5/assignment 6-react wordle redux-3.docx
@@ -381,6 +381,16 @@
         <w:t xml:space="preserve"> your assignment running online</w:t>
       </w:r>
     </w:p>
+    <w:p>
+      <w:hyperlink r:id="rId8" w:history="1">
+        <w:r>
+          <w:rPr>
+            <w:rStyle w:val="Hyperlink"/>
+          </w:rPr>
+          <w:t>https://pochat.github.io/harvard-dgmd-e-28/Assignment%205/redux-logic.html</w:t>
+        </w:r>
+      </w:hyperlink>
+    </w:p>
     <w:p/>
     <w:p>
       <w:pPr>
@@ -431,7 +441,95 @@
         <w:t>React?</w:t>
       </w:r>
     </w:p>
-    <w:p/>
+    <w:p>
+      <w:pPr>
+        <w:rPr>
+          <w:color w:val="0070C0"/>
+        </w:rPr>
+      </w:pPr>
+      <w:r>
+        <w:rPr>
+          <w:color w:val="0070C0"/>
+        </w:rPr>
+        <w:t xml:space="preserve">So far, creating elements is straight forward in JS alone. React code needs many more </w:t>
+      </w:r>
+      <w:r>
+        <w:rPr>
+          <w:color w:val="0070C0"/>
+        </w:rPr>
+        <w:t>lines of code, such as</w:t>
+      </w:r>
+      <w:r>
+        <w:rPr>
+          <w:color w:val="0070C0"/>
+        </w:rPr>
+        <w:t xml:space="preserve"> setting the div for #myapp, </w:t>
+      </w:r>
+      <w:r>
+        <w:rPr>
+          <w:color w:val="0070C0"/>
+        </w:rPr>
+        <w:t xml:space="preserve">rendering </w:t>
+      </w:r>
+      <w:r>
+        <w:rPr>
+          <w:color w:val="0070C0"/>
+        </w:rPr>
+        <w:t xml:space="preserve">the DOM root object, and the </w:t>
+      </w:r>
+      <w:proofErr w:type="spellStart"/>
+      <w:r>
+        <w:rPr>
+          <w:color w:val="0070C0"/>
+        </w:rPr>
+        <w:t>React.createElement</w:t>
+      </w:r>
+      <w:proofErr w:type="spellEnd"/>
+      <w:r>
+        <w:rPr>
+          <w:color w:val="0070C0"/>
+        </w:rPr>
+        <w:t xml:space="preserve">. Also, React combines syntax in one line, such as </w:t>
+      </w:r>
+      <w:r>
+        <w:rPr>
+          <w:color w:val="0070C0"/>
+        </w:rPr>
+        <w:t>('div', {</w:t>
+      </w:r>
+      <w:proofErr w:type="spellStart"/>
+      <w:r>
+        <w:rPr>
+          <w:color w:val="0070C0"/>
+        </w:rPr>
+        <w:t>className</w:t>
+      </w:r>
+      <w:proofErr w:type="spellEnd"/>
+      <w:r>
+        <w:rPr>
+          <w:color w:val="0070C0"/>
+        </w:rPr>
+        <w:t>: 'box'}, "F")</w:t>
+      </w:r>
+      <w:r>
+        <w:rPr>
+          <w:color w:val="0070C0"/>
+        </w:rPr>
+        <w:t xml:space="preserve">, which is cumbersome. Perhaps, it is </w:t>
+      </w:r>
+      <w:r>
+        <w:rPr>
+          <w:color w:val="0070C0"/>
+        </w:rPr>
+        <w:t>just a</w:t>
+      </w:r>
+      <w:r>
+        <w:rPr>
+          <w:color w:val="0070C0"/>
+        </w:rPr>
+        <w:t xml:space="preserve"> matter of getting used to it.</w:t>
+      </w:r>
+    </w:p>
     <w:p>
       <w:pPr>
         <w:pStyle w:val="Heading2"/>
@@ -490,7 +588,7 @@
       </w:r>
     </w:p>
     <w:sectPr>
-      <w:footerReference w:type="default" r:id="rId8"/>
+      <w:footerReference w:type="default" r:id="rId9"/>
       <w:pgSz w:w="12240" w:h="15840" w:code="1"/>
       <w:pgMar w:top="864" w:right="1008" w:bottom="1152" w:left="1008" w:header="720" w:footer="864" w:gutter="0"/>
       <w:cols w:space="720"/>

</xml_diff>